<commit_message>
Refoco em 2 tecnicas (face swap alinhado + edicao de campos) e Fase 3
Corta crop_and_move/digito_verificador/recaptura_tela/reimpressao (so as 2 fraudes reais permanecem); face swap reescrito com MediaPipe (478 landmarks, alinhamento por similaridade, mascara por silhueta, Reinhard+Poisson); integra BID com caixas ground-truth e paridade de pipeline (captura compartilhada, remover_tinta, harmonizar_textura anti-atalho); Fase 3 com embeddings DinoV2, classificador leve e sonda com split por documento; ambiente py3.14/torch cu128, opencv-contrib unificado. Inclui correcoes de bugs do face swap: nitidez de referencia 2D, RNG por alvo, caixa clampeada, download de modelo seguro; remove codigo morto.
</commit_message>
<xml_diff>
--- a/docs/documentacao_deteccao_fraude.docx
+++ b/docs/documentacao_deteccao_fraude.docx
@@ -4476,6 +4476,652 @@
       </w:pPr>
       <w:r>
         <w:t xml:space="preserve">Orientações da Autoridade Nacional de Proteção de Dados (ANPD) sobre os critérios de anonimização e o risco de reidentificação.</w:t>
+      </w:r>
+    </w:p>
+    <w:p>
+      <w:pPr>
+        <w:pStyle w:val="Heading1"/>
+      </w:pPr>
+      <w:r>
+        <w:t xml:space="preserve">10. Geração de fraude (v2) — diagnóstico do Synthetic Utility Gap e especificação de implementação</w:t>
+      </w:r>
+    </w:p>
+    <w:p>
+      <w:pPr>
+        <w:spacing w:after="160"/>
+      </w:pPr>
+      <w:r>
+        <w:t xml:space="preserve">Complemento adicionado em 2026-07-03. Esta seção registra (a) o diagnóstico de por que os dados de treino de fraude da v1 ensinariam o classificador a reconhecer o gerador em vez da fraude, e (b) a especificação da geração de fraude v2 que corrige isso. Nota terminológica adotada no projeto: as falsificações geradas são tratadas como DADOS DE TREINAMENTO — a qualidade delas define diretamente o que o classificador (DinoV2 + cabeça leve, Seção 5.3) consegue aprender.</w:t>
+      </w:r>
+    </w:p>
+    <w:p>
+      <w:pPr>
+        <w:pStyle w:val="Heading2"/>
+      </w:pPr>
+      <w:r>
+        <w:t xml:space="preserve">10.1 Diagnóstico — por que os dados v1 ensinam o gerador, não a fraude</w:t>
+      </w:r>
+    </w:p>
+    <w:p>
+      <w:pPr>
+        <w:spacing w:after="160"/>
+      </w:pPr>
+      <w:r>
+        <w:t xml:space="preserve">A literatura recente (2022–2026) é consistente: classificadores de forense tendem a superajustar aos artefatos específicos do gerador de fraude, e detectores baseados em modelos de fundação como o DinoV2 superconfiam em artefatos GLOBAIS da imagem (arXiv 2602.00192). Consequência direta para este projeto: qualquer diferença global e sistemática entre a classe legítima e a classe fraude vira um atalho que o modelo aprende no lugar da manipulação real. É a manifestação concreta do Synthetic Utility Gap (Seção 7.2).</w:t>
+      </w:r>
+    </w:p>
+    <w:p>
+      <w:pPr>
+        <w:spacing w:after="160"/>
+      </w:pPr>
+      <w:r>
+        <w:t xml:space="preserve">Vazamentos identificados no código de geração v1 (scripts/geracao_fraude/), em ordem de gravidade:</w:t>
+      </w:r>
+    </w:p>
+    <w:p>
+      <w:pPr>
+        <w:pStyle w:val="ListParagraph"/>
+        <w:numPr>
+          <w:ilvl w:val="0"/>
+          <w:numId w:val="1"/>
+        </w:numPr>
+        <w:spacing w:after="120"/>
+      </w:pPr>
+      <w:r>
+        <w:rPr>
+          <w:b/>
+        </w:rPr>
+        <w:t xml:space="preserve">Vazamento global de pipeline (crítico). </w:t>
+      </w:r>
+      <w:r>
+        <w:t xml:space="preserve">Os documentos legítimos eram usados crus, mas toda fraude passava por re-encode JPEG (qualidade 92/85); recaptura_tela e reimpressao ainda aplicavam filtros na imagem inteira mais GaussianBlur(3,3) e cascata JPEG. A classe fraude carregava assim uma estatística global (dupla compressão, blur, ruído) ausente na classe legítima — o modelo separa as classes só por isso, sem olhar a fraude. É o mesmo fenômeno do 'text-background bias' descrito em ADCD-Net (arXiv 2507.16397).</w:t>
+      </w:r>
+    </w:p>
+    <w:p>
+      <w:pPr>
+        <w:pStyle w:val="ListParagraph"/>
+        <w:numPr>
+          <w:ilvl w:val="0"/>
+          <w:numId w:val="1"/>
+        </w:numPr>
+        <w:spacing w:after="120"/>
+      </w:pPr>
+      <w:r>
+        <w:rPr>
+          <w:b/>
+        </w:rPr>
+        <w:t xml:space="preserve">Determinismo e baixa diversidade de artefatos. </w:t>
+      </w:r>
+      <w:r>
+        <w:t xml:space="preserve">reimpressao usava uma matriz de Bayer 4×4 fixa (treliça de halftone idêntica em toda amostra); edicao_campos e digito_verificador usavam sempre cv2.INPAINT_TELEA (assinatura de borrão constante e aprendível — cf. DiffusionPrint, arXiv 2604.12443); apenas 2–3 valores de texto hardcoded e ~5 fontes de sistema (DejaVu/Liberation); a variante 'fonte_incorreta' (Serif-Italic + deslocamento vertical) era um tell irreal.</w:t>
+      </w:r>
+    </w:p>
+    <w:p>
+      <w:pPr>
+        <w:pStyle w:val="ListParagraph"/>
+        <w:numPr>
+          <w:ilvl w:val="0"/>
+          <w:numId w:val="1"/>
+        </w:numPr>
+        <w:spacing w:after="120"/>
+      </w:pPr>
+      <w:r>
+        <w:rPr>
+          <w:b/>
+        </w:rPr>
+        <w:t xml:space="preserve">Sintético vs. físico. </w:t>
+      </w:r>
+      <w:r>
+        <w:t xml:space="preserve">O padrão-ouro para recaptura de tela e reimpressão é a captura física real (SIDTD imprimiu 191 documentos em HP Color LaserJet + laminação; FantasyID idem). Aproximações puramente sintéticas de moiré/halftone tendem a ser fingerprintadas; o próprio código v1 já registrava isso no campo 'aviso' dos manifestos.</w:t>
+      </w:r>
+    </w:p>
+    <w:p>
+      <w:pPr>
+        <w:pStyle w:val="Heading2"/>
+      </w:pPr>
+      <w:r>
+        <w:t xml:space="preserve">10.2 Princípios de correção (fundamentados na literatura)</w:t>
+      </w:r>
+    </w:p>
+    <w:p>
+      <w:pPr>
+        <w:pStyle w:val="ListParagraph"/>
+        <w:numPr>
+          <w:ilvl w:val="0"/>
+          <w:numId w:val="1"/>
+        </w:numPr>
+        <w:spacing w:after="120"/>
+      </w:pPr>
+      <w:r>
+        <w:rPr>
+          <w:b/>
+        </w:rPr>
+        <w:t xml:space="preserve">P1 — Paridade de pipeline. </w:t>
+      </w:r>
+      <w:r>
+        <w:t xml:space="preserve">Ideia central do Self-Blended Images (Shiohara &amp; Yamasaki, CVPR 2022), a técnica que mais melhorou a generalização em detecção de face forgery: gerar a fraude de modo que a ÚNICA diferença para o legítimo seja a inconsistência LOCAL da manipulação. Na prática: um único simulador de 'captura final' (scripts/comum/captura.py) é aplicado tanto aos legítimos quanto a todas as fraudes, com a mesma distribuição aleatória — eliminando qualquer atalho global e obrigando o modelo a olhar a região manipulada.</w:t>
+      </w:r>
+    </w:p>
+    <w:p>
+      <w:pPr>
+        <w:pStyle w:val="ListParagraph"/>
+        <w:numPr>
+          <w:ilvl w:val="0"/>
+          <w:numId w:val="1"/>
+        </w:numPr>
+        <w:spacing w:after="120"/>
+      </w:pPr>
+      <w:r>
+        <w:rPr>
+          <w:b/>
+        </w:rPr>
+        <w:t xml:space="preserve">P2 — Diversificação máxima de cada artefato. </w:t>
+      </w:r>
+      <w:r>
+        <w:t xml:space="preserve">Mitigação direta do Synthetic Utility Gap (Seção 7.2; revisão sistemática arXiv 2511.06056): rotacionar métodos de inpainting (TELEA, NS, patch-based, textura real), múltiplos algoritmos de halftone com parâmetros aleatórios, faixa larga de qualidade/subamostragem JPEG (faixas estreitas de fator de qualidade pioram a generalização — DocQT, arXiv 2605.19688), e pools grandes de nomes/CPF/datas (Faker pt-BR) e de fontes. Nunca depender de um único método por técnica.</w:t>
+      </w:r>
+    </w:p>
+    <w:p>
+      <w:pPr>
+        <w:pStyle w:val="ListParagraph"/>
+        <w:numPr>
+          <w:ilvl w:val="0"/>
+          <w:numId w:val="1"/>
+        </w:numPr>
+        <w:spacing w:after="120"/>
+      </w:pPr>
+      <w:r>
+        <w:rPr>
+          <w:b/>
+        </w:rPr>
+        <w:t xml:space="preserve">P3 — Validação anti-atalho (obrigatória). </w:t>
+      </w:r>
+      <w:r>
+        <w:t xml:space="preserve">(a) Validação cruzada leave-one-technique-out (treinar em N−1 técnicas, testar na retida). (b) Sonda 'somente-global': um classificador linear treinado apenas em estatísticas globais (blocagem JPEG, energia de alta frequência da FFT, média/desvio por canal, variância do Laplaciano, estimativa de ruído) deve ficar próximo do acaso (AUC ≈ 0,5–0,6) — se separar bem as classes, há atalho global. (c) Idealmente, um pequeno conjunto de recapturas físicas reais como teste de generalização (Reality Gap, Seção 7.1).</w:t>
+      </w:r>
+    </w:p>
+    <w:p>
+      <w:pPr>
+        <w:pStyle w:val="Heading2"/>
+      </w:pPr>
+      <w:r>
+        <w:t xml:space="preserve">10.3 Especificação de implementação da v2</w:t>
+      </w:r>
+    </w:p>
+    <w:p>
+      <w:pPr>
+        <w:pStyle w:val="ListParagraph"/>
+        <w:numPr>
+          <w:ilvl w:val="0"/>
+          <w:numId w:val="1"/>
+        </w:numPr>
+        <w:spacing w:after="120"/>
+      </w:pPr>
+      <w:r>
+        <w:rPr>
+          <w:b/>
+        </w:rPr>
+        <w:t xml:space="preserve">Módulo compartilhado scripts/comum/captura.py. </w:t>
+      </w:r>
+      <w:r>
+        <w:t xml:space="preserve">simular_captura(imagem, rng): jitter geométrico leve (rotação/perspectiva/resize de enquadramento), fotométrico (brilho/contraste/balanço de branco, vinheta/gradiente de iluminação), ruído de sensor Poisson-Gaussiano (reutiliza comum/ruido.py), desfoque de foco opcional, e compressão JPEG com fator de qualidade em faixa larga e subamostragem de croma variável (opcionalmente 2 passadas). Aplicado a TODA saída (legítimo e cada técnica de fraude) com a mesma distribuição.</w:t>
+      </w:r>
+    </w:p>
+    <w:p>
+      <w:pPr>
+        <w:pStyle w:val="ListParagraph"/>
+        <w:numPr>
+          <w:ilvl w:val="0"/>
+          <w:numId w:val="1"/>
+        </w:numPr>
+        <w:spacing w:after="120"/>
+      </w:pPr>
+      <w:r>
+        <w:rPr>
+          <w:b/>
+        </w:rPr>
+        <w:t xml:space="preserve">Nova classe negativa. </w:t>
+      </w:r>
+      <w:r>
+        <w:t xml:space="preserve">datasets/legitimos_processados/ — os documentos legítimos passados por simular_captura (rótulo 0). Corrige o maior atalho: na v1 a classe negativa eram os legítimos crus, globalmente distintos das fraudes processadas.</w:t>
+      </w:r>
+    </w:p>
+    <w:p>
+      <w:pPr>
+        <w:pStyle w:val="ListParagraph"/>
+        <w:numPr>
+          <w:ilvl w:val="0"/>
+          <w:numId w:val="1"/>
+        </w:numPr>
+        <w:spacing w:after="120"/>
+      </w:pPr>
+      <w:r>
+        <w:rPr>
+          <w:b/>
+        </w:rPr>
+        <w:t xml:space="preserve">Ordem por amostra. </w:t>
+      </w:r>
+      <w:r>
+        <w:t xml:space="preserve">[documento limpo] → (manipulação específica da técnica, ANTES da captura) → simular_captura → salvar. Legítimo: [documento limpo] → simular_captura.</w:t>
+      </w:r>
+    </w:p>
+    <w:p>
+      <w:pPr>
+        <w:pStyle w:val="ListParagraph"/>
+        <w:numPr>
+          <w:ilvl w:val="0"/>
+          <w:numId w:val="1"/>
+        </w:numPr>
+        <w:spacing w:after="120"/>
+      </w:pPr>
+      <w:r>
+        <w:rPr>
+          <w:b/>
+        </w:rPr>
+        <w:t xml:space="preserve">Por técnica. </w:t>
+      </w:r>
+      <w:r>
+        <w:t xml:space="preserve">troca_foto: manter variedade de blend (simples/Poisson) e ampliar; edicao_campos e digito_verificador: valores via Faker pt-BR, pool amplo de fontes (incluindo similares às oficiais, monoespaçadas/OCR-B), 'fonte_incorreta' com incompatibilidades sutis e realistas, rotação de backends de inpainting; crop_and_move: diversificar preenchimento e feather; recaptura_tela: diversificar moiré (frequência/ângulo/reamostragem/modelo de subpixel) e reflexo/vinheta opcionais; reimpressao: múltiplos algoritmos de halftone — Bayer ordenado (2×2/4×4/8×8), Floyd-Steinberg, Atkinson, tela AM/FM CMYK com roseta (ângulos 15/45/75/90° e LPI/DPI variáveis), escolhidos aleatoriamente por amostra.</w:t>
+      </w:r>
+    </w:p>
+    <w:p>
+      <w:pPr>
+        <w:pStyle w:val="ListParagraph"/>
+        <w:numPr>
+          <w:ilvl w:val="0"/>
+          <w:numId w:val="1"/>
+        </w:numPr>
+        <w:spacing w:after="120"/>
+      </w:pPr>
+      <w:r>
+        <w:rPr>
+          <w:b/>
+        </w:rPr>
+        <w:t xml:space="preserve">Manifesto. </w:t>
+      </w:r>
+      <w:r>
+        <w:t xml:space="preserve">Novos campos: metodo_inpaint, metodo_halftone, fonte, parametros_captura e rotulo (legitimo|fraude), preservando a rastreabilidade para validação cruzada por técnica e revogação de consentimento.</w:t>
+      </w:r>
+    </w:p>
+    <w:p>
+      <w:pPr>
+        <w:pStyle w:val="ListParagraph"/>
+        <w:numPr>
+          <w:ilvl w:val="0"/>
+          <w:numId w:val="1"/>
+        </w:numPr>
+        <w:spacing w:after="120"/>
+      </w:pPr>
+      <w:r>
+        <w:rPr>
+          <w:b/>
+        </w:rPr>
+        <w:t xml:space="preserve">Script scripts/avaliacao/sanity_atalho.py. </w:t>
+      </w:r>
+      <w:r>
+        <w:t xml:space="preserve">Implementa a sonda 'somente-global' (P3): extrai estatísticas globais de legítimos vs. fraudes, treina uma regressão logística e reporta AUC, além de leave-one-technique-out. Critério de sucesso: AUC da sonda global próxima do acaso.</w:t>
+      </w:r>
+    </w:p>
+    <w:p>
+      <w:pPr>
+        <w:pStyle w:val="Heading2"/>
+      </w:pPr>
+      <w:r>
+        <w:t xml:space="preserve">10.4 Decisões desta iteração (2026-07-03)</w:t>
+      </w:r>
+    </w:p>
+    <w:p>
+      <w:pPr>
+        <w:pStyle w:val="ListParagraph"/>
+        <w:numPr>
+          <w:ilvl w:val="0"/>
+          <w:numId w:val="1"/>
+        </w:numPr>
+        <w:spacing w:after="120"/>
+      </w:pPr>
+      <w:r>
+        <w:rPr>
+          <w:b/>
+        </w:rPr>
+        <w:t xml:space="preserve">Recaptura/reimpressão. </w:t>
+      </w:r>
+      <w:r>
+        <w:t xml:space="preserve">Manter sintético diversificado + validar (não coletar dados físicos nesta fase); registrado como o elo mais fraco do pipeline até que existam capturas físicas reais para treino/validação.</w:t>
+      </w:r>
+    </w:p>
+    <w:p>
+      <w:pPr>
+        <w:pStyle w:val="ListParagraph"/>
+        <w:numPr>
+          <w:ilvl w:val="0"/>
+          <w:numId w:val="1"/>
+        </w:numPr>
+        <w:spacing w:after="120"/>
+      </w:pPr>
+      <w:r>
+        <w:rPr>
+          <w:b/>
+        </w:rPr>
+        <w:t xml:space="preserve">Escopo. </w:t>
+      </w:r>
+      <w:r>
+        <w:t xml:space="preserve">Refatoração completa da v2: captura compartilhada + diversificação de todas as técnicas + script anti-atalho + regeneração do dataset + verificação (testes e inspeção de amostras).</w:t>
+      </w:r>
+    </w:p>
+    <w:p>
+      <w:pPr>
+        <w:pStyle w:val="ListParagraph"/>
+        <w:numPr>
+          <w:ilvl w:val="0"/>
+          <w:numId w:val="1"/>
+        </w:numPr>
+        <w:spacing w:after="120"/>
+      </w:pPr>
+      <w:r>
+        <w:rPr>
+          <w:b/>
+        </w:rPr>
+        <w:t xml:space="preserve">Limitação registrada. </w:t>
+      </w:r>
+      <w:r>
+        <w:t xml:space="preserve">Diversidade real de tabela de quantização JPEG não-libjpeg (além de fator de qualidade + subamostragem) fica como extensão futura, conforme DocQT.</w:t>
+      </w:r>
+    </w:p>
+    <w:p>
+      <w:pPr>
+        <w:pStyle w:val="Heading2"/>
+      </w:pPr>
+      <w:r>
+        <w:t xml:space="preserve">10.5 Referências novas (v2)</w:t>
+      </w:r>
+    </w:p>
+    <w:p>
+      <w:pPr>
+        <w:spacing w:after="160"/>
+      </w:pPr>
+      <w:r>
+        <w:t xml:space="preserve">Shiohara, K. &amp; Yamasaki, T. — Detecting Deepfakes with Self-Blended Images. CVPR 2022. (Paridade de pipeline / inconsistência local como sinal generalizável.)</w:t>
+      </w:r>
+    </w:p>
+    <w:p>
+      <w:pPr>
+        <w:spacing w:after="160"/>
+      </w:pPr>
+      <w:r>
+        <w:t xml:space="preserve">AI-Generated Image Detectors Overrely on Global Artifacts: Evidence from Inpainting Exchange — arXiv 2602.00192 (2026).</w:t>
+      </w:r>
+    </w:p>
+    <w:p>
+      <w:pPr>
+        <w:spacing w:after="160"/>
+      </w:pPr>
+      <w:r>
+        <w:t xml:space="preserve">DiffusionPrint: Learning Generative Fingerprints for Diffusion-Based Inpainting Localization — arXiv 2604.12443 (2026). (Fingerprint de método de inpainting.)</w:t>
+      </w:r>
+    </w:p>
+    <w:p>
+      <w:pPr>
+        <w:spacing w:after="160"/>
+      </w:pPr>
+      <w:r>
+        <w:t xml:space="preserve">ADCD-Net: Robust Document Image Forgery Localization via Adaptive DCT Feature and Hierarchical Content Disentanglement — arXiv 2507.16397 (2025). (Text-background bias.)</w:t>
+      </w:r>
+    </w:p>
+    <w:p>
+      <w:pPr>
+        <w:spacing w:after="160"/>
+      </w:pPr>
+      <w:r>
+        <w:t xml:space="preserve">DocQT: Improving Document Forgery Localization Robustness via Diverse JPEG Quantization Tables — arXiv 2605.19688 (2026).</w:t>
+      </w:r>
+    </w:p>
+    <w:p>
+      <w:pPr>
+        <w:spacing w:after="160"/>
+      </w:pPr>
+      <w:r>
+        <w:t xml:space="preserve">Moiré Spectral Augmentation and Masked Frequency Modeling for Document Presentation Attack Detection (2025).</w:t>
+      </w:r>
+    </w:p>
+    <w:p>
+      <w:pPr>
+        <w:spacing w:after="160"/>
+      </w:pPr>
+      <w:r>
+        <w:t xml:space="preserve">SIDTD — Synthetic dataset of ID and Travel Documents, Nature Scientific Data (2024). (Crop&amp;Replace + inpainting + impressão física.)</w:t>
+      </w:r>
+    </w:p>
+    <w:p>
+      <w:pPr>
+        <w:pStyle w:val="Heading2"/>
+      </w:pPr>
+      <w:r>
+        <w:t xml:space="preserve">10.6 Resultados da primeira execução da v2 (2026-07-03)</w:t>
+      </w:r>
+    </w:p>
+    <w:p>
+      <w:pPr>
+        <w:spacing w:after="160"/>
+      </w:pPr>
+      <w:r>
+        <w:t xml:space="preserve">Primeira execução ponta a ponta do pipeline v2 na VPS, com o objetivo de validar funcionamento e medir o atalho global (não de produzir o dataset final).</w:t>
+      </w:r>
+    </w:p>
+    <w:p>
+      <w:pPr>
+        <w:pStyle w:val="ListParagraph"/>
+        <w:numPr>
+          <w:ilvl w:val="0"/>
+          <w:numId w:val="1"/>
+        </w:numPr>
+        <w:spacing w:after="120"/>
+      </w:pPr>
+      <w:r>
+        <w:rPr>
+          <w:b/>
+        </w:rPr>
+        <w:t xml:space="preserve">Ambiente e otimizações. </w:t>
+      </w:r>
+      <w:r>
+        <w:t xml:space="preserve">VPS 2 vCPU sem GPU. Instalados no venv: faker e scikit-learn; 48 fontes .ttf (Arimo/Cousine/Tinos/Liberation/Free/DejaVu). Duas otimizações necessárias, aplicadas IGUALMENTE às duas classes: cap de resolução de captura em 1024 px (realista para foto de celular + desempenho) e cap absoluto de 360 px na difusão de erro do halftone (Floyd-Steinberg/Atkinson são sequenciais em Python puro).</w:t>
+      </w:r>
+    </w:p>
+    <w:p>
+      <w:pPr>
+        <w:pStyle w:val="ListParagraph"/>
+        <w:numPr>
+          <w:ilvl w:val="0"/>
+          <w:numId w:val="1"/>
+        </w:numPr>
+        <w:spacing w:after="120"/>
+      </w:pPr>
+      <w:r>
+        <w:rPr>
+          <w:b/>
+        </w:rPr>
+        <w:t xml:space="preserve">Saídas (variantes=2, 16 documentos legítimos). </w:t>
+      </w:r>
+      <w:r>
+        <w:t xml:space="preserve">troca_foto 32, crop_and_move 32, digito_verificador 100, edicao_campos parcial (~24), recaptura_tela 32, reimpressao 32; legitimos_processados 32. Todas salvas em PNG.</w:t>
+      </w:r>
+    </w:p>
+    <w:p>
+      <w:pPr>
+        <w:pStyle w:val="ListParagraph"/>
+        <w:numPr>
+          <w:ilvl w:val="0"/>
+          <w:numId w:val="1"/>
+        </w:numPr>
+        <w:spacing w:after="120"/>
+      </w:pPr>
+      <w:r>
+        <w:rPr>
+          <w:b/>
+        </w:rPr>
+        <w:t xml:space="preserve">Sonda anti-atalho (somente-global). </w:t>
+      </w:r>
+      <w:r>
+        <w:t xml:space="preserve">AUC = 0,582 ± 0,093 — zona "sem atalho global". Na v1 (legítimo cru vs. fraude comprimida/borrada) esse valor seria próximo de 1,0. Confirma empiricamente que a paridade de pipeline (P1) eliminou o atalho global — resultado central desta iteração.</w:t>
+      </w:r>
+    </w:p>
+    <w:p>
+      <w:pPr>
+        <w:pStyle w:val="ListParagraph"/>
+        <w:numPr>
+          <w:ilvl w:val="0"/>
+          <w:numId w:val="1"/>
+        </w:numPr>
+        <w:spacing w:after="120"/>
+      </w:pPr>
+      <w:r>
+        <w:rPr>
+          <w:b/>
+        </w:rPr>
+        <w:t xml:space="preserve">Leave-one-technique-out (AUC somente-global). </w:t>
+      </w:r>
+      <w:r>
+        <w:t xml:space="preserve">recaptura_tela 0,554; troca_foto 0,587; crop_and_move 0,615; digito_verificador 0,676; reimpressao 0,718; edicao_campos 0,754. A maioria perto do acaso; reimpressao e edicao_campos ainda com sinal global residual.</w:t>
+      </w:r>
+    </w:p>
+    <w:p>
+      <w:pPr>
+        <w:pStyle w:val="ListParagraph"/>
+        <w:numPr>
+          <w:ilvl w:val="0"/>
+          <w:numId w:val="1"/>
+        </w:numPr>
+        <w:spacing w:after="120"/>
+      </w:pPr>
+      <w:r>
+        <w:rPr>
+          <w:b/>
+        </w:rPr>
+        <w:t xml:space="preserve">Pendências. </w:t>
+      </w:r>
+      <w:r>
+        <w:t xml:space="preserve">(a) troca_foto: o rosto substituto às vezes é colado fora do cartão — a detecção de rosto erra a caixa-alvo nesses documentos; restringir/validar a caixa ao cartão. (b) reimpressao: sinal global residual (halftone/dessaturação são globais por natureza); ampliar a faixa de saturação também nos legítimos. (c) edicao_campos: reexecutar completo (a rodada foi parcial) e reavaliar; o OCR com rotações é lento (~15 s/doc) — avaliar cache/limite de rotações. (d) Próxima alavanca: inpainting generativo (LaMa/difusão), adiado por falta de GPU.</w:t>
+      </w:r>
+    </w:p>
+    <w:p>
+      <w:pPr>
+        <w:pStyle w:val="ListParagraph"/>
+        <w:numPr>
+          <w:ilvl w:val="0"/>
+          <w:numId w:val="1"/>
+        </w:numPr>
+        <w:spacing w:after="120"/>
+      </w:pPr>
+      <w:r>
+        <w:rPr>
+          <w:b/>
+        </w:rPr>
+        <w:t xml:space="preserve">Testes. </w:t>
+      </w:r>
+      <w:r>
+        <w:t xml:space="preserve">pytest 16/16 passando após a refatoração.</w:t>
+      </w:r>
+    </w:p>
+    <w:p>
+      <w:pPr>
+        <w:pStyle w:val="Heading2"/>
+      </w:pPr>
+      <w:r>
+        <w:t xml:space="preserve">10.7 Dataset v2 completo — resultados finais (2026-07-03)</w:t>
+      </w:r>
+    </w:p>
+    <w:p>
+      <w:pPr>
+        <w:pStyle w:val="ListParagraph"/>
+        <w:numPr>
+          <w:ilvl w:val="0"/>
+          <w:numId w:val="1"/>
+        </w:numPr>
+        <w:spacing w:after="120"/>
+      </w:pPr>
+      <w:r>
+        <w:rPr>
+          <w:b/>
+        </w:rPr>
+        <w:t xml:space="preserve">Dataset gerado. </w:t>
+      </w:r>
+      <w:r>
+        <w:t xml:space="preserve">926 imagens (766 fraude + 160 legítimo), 1,3 GB em PNG, ~29 min na VPS. Distribuição: troca_foto 160, crop_and_move 160, digito_verificador 100, edicao_campos 26, recaptura_tela 160, reimpressao 160; legitimos_processados 160 (variantes-por-documento=10 sobre 16 documentos legítimos).</w:t>
+      </w:r>
+    </w:p>
+    <w:p>
+      <w:pPr>
+        <w:pStyle w:val="ListParagraph"/>
+        <w:numPr>
+          <w:ilvl w:val="0"/>
+          <w:numId w:val="1"/>
+        </w:numPr>
+        <w:spacing w:after="120"/>
+      </w:pPr>
+      <w:r>
+        <w:rPr>
+          <w:b/>
+        </w:rPr>
+        <w:t xml:space="preserve">Sonda anti-atalho (conjunto completo). </w:t>
+      </w:r>
+      <w:r>
+        <w:t xml:space="preserve">AUC somente-global = 0,572 ± 0,171. Leave-one-technique-out: crop_and_move 0,544; digito_verificador 0,520; edicao_campos 0,664; recaptura_tela 0,586; reimpressao 0,474; troca_foto 0,528. Todas ≤ 0,66 — nenhum atalho global relevante. Confirma no conjunto completo o efeito da paridade de pipeline; os valores 0,72–0,75 vistos no lote de teste pequeno eram viés de amostra.</w:t>
+      </w:r>
+    </w:p>
+    <w:p>
+      <w:pPr>
+        <w:pStyle w:val="ListParagraph"/>
+        <w:numPr>
+          <w:ilvl w:val="0"/>
+          <w:numId w:val="1"/>
+        </w:numPr>
+        <w:spacing w:after="120"/>
+      </w:pPr>
+      <w:r>
+        <w:rPr>
+          <w:b/>
+        </w:rPr>
+        <w:t xml:space="preserve">Correção troca_foto. </w:t>
+      </w:r>
+      <w:r>
+        <w:t xml:space="preserve">Filtro de plausibilidade do rosto (proporção 0,6–1,4 e fração de área 0,2–25% da imagem) resolveu o caso em que o rosto substituto era colado fora do cartão; agora o splice fica sobre a foto do documento.</w:t>
+      </w:r>
+    </w:p>
+    <w:p>
+      <w:pPr>
+        <w:pStyle w:val="ListParagraph"/>
+        <w:numPr>
+          <w:ilvl w:val="0"/>
+          <w:numId w:val="1"/>
+        </w:numPr>
+        <w:spacing w:after="120"/>
+      </w:pPr>
+      <w:r>
+        <w:rPr>
+          <w:b/>
+        </w:rPr>
+        <w:t xml:space="preserve">Sincronização. </w:t>
+      </w:r>
+      <w:r>
+        <w:t xml:space="preserve">Dataset copiado para a máquina do usuário (datasets/fraude_gerada e datasets/legitimos_processados); o dataset v1 antigo foi preservado em datasets/_fraude_gerada_v1_backup (local e VPS).</w:t>
+      </w:r>
+    </w:p>
+    <w:p>
+      <w:pPr>
+        <w:pStyle w:val="ListParagraph"/>
+        <w:numPr>
+          <w:ilvl w:val="0"/>
+          <w:numId w:val="1"/>
+        </w:numPr>
+        <w:spacing w:after="120"/>
+      </w:pPr>
+      <w:r>
+        <w:rPr>
+          <w:b/>
+        </w:rPr>
+        <w:t xml:space="preserve">Pendência. </w:t>
+      </w:r>
+      <w:r>
+        <w:t xml:space="preserve">edicao_campos tem apenas 26 amostras (poucos documentos têm rótulos de campo detectáveis pelo OCR atual) e a maior AUC-global residual (0,664) — é a técnica mais fraca em volume; melhorar a detecção de campos ou migrar para inpainting generativo (upgrade futuro, requer GPU).</w:t>
       </w:r>
     </w:p>
     <w:sectPr>

</xml_diff>